<commit_message>
Generate daily DOCX and PDF documents
</commit_message>
<xml_diff>
--- a/Tagesberichte/DubraSec_Tagesbericht_2026-10-29.docx
+++ b/Tagesberichte/DubraSec_Tagesbericht_2026-10-29.docx
@@ -30,7 +30,7 @@
     </w:p>
     <w:p>
       <w:r>
-        <w:t>Gesamtrisikoeinschätzung: ERHÖHT für die internationale externe Sicherheitslage; für deutsche AXA-Standorte aus den geprüften Meldungen keine konkrete neue Gefährdung ableitbar. Der Schwerpunkt liegt auf weiteren Drohnenangriffen auf Strom- und Treibstoffanlagen im Sudan, einer neuen internationalen Reaktion auf die dortigen Angriffe und der fortdauernden Unsicherheit um den behaupteten Raffinerietreffer in Saudi-Arabien. Im Cyberbereich sind am 28. Oktober neue Auswertungen von Ransomware-Leaksite-Behauptungen erschienen. Eine Täterbehauptung ist keine Bestätigung eines erfolgreichen Angriffs.</w:t>
+        <w:t>Gesamtrisikoeinschätzung: ERHÖHT für die internationale externe Sicherheitslage; für deutsche AXA-Standorte aus den geprüften Meldungen keine konkrete neue Gefährdung ableitbar. Der Schwerpunkt umfasst die am 28. Oktober bekannt gewordenen Ermittlungen zu einem mutmaßlichen Sabotageplan gegen ein Gebäude oder KRITIS im Raum Nürnberg, neue Recherchen über Cyberangriffe auf industrielle Steuerungen sowie die Drohnenangriffe auf Strom- und Treibstoffanlagen im Sudan. Vorausschauend besonders relevant sind die für den 31. Oktober angekündigten Gen-Z-Proteste in mehr als 30 deutschen Städten und die Halloween-Sicherheitslage. Die Polizei meldet bislang keine konkreten Hinweise auf geplante Gewalttaten bei den Demonstrationen; eine Demonstration ist kein Gewaltvorfall. Die behauptete Täterschaft bei Auslandsvorfällen bleibt getrennt von gesicherten Fakten.</w:t>
       </w:r>
     </w:p>
     <w:p>
@@ -220,6 +220,49 @@
     </w:p>
     <w:p>
       <w:pPr>
+        <w:pStyle w:val="Heading2"/>
+      </w:pPr>
+      <w:r>
+        <w:t>05 | DEUTSCHLAND / NÜRNBERG – Ermittlungen wegen mutmaßlich geplanter Sabotage</w:t>
+      </w:r>
+    </w:p>
+    <w:p>
+      <w:r>
+        <w:t>Ereignisdatum: mutmaßliche Vorbereitung vor 07.10.2026; Untersuchungshaft seit 07.10.2026. Neue Veröffentlichung: 28.10.2026, Tagesschau/BR, 20:03 Uhr.</w:t>
+      </w:r>
+    </w:p>
+    <w:p>
+      <w:r>
+        <w:t>Die Generalstaatsanwaltschaft München bestätigte Ermittlungen gegen zwei belarussische Staatsangehörige wegen des dringenden Verdachts, im Raum Nürnberg gegen Bezahlung und im Auftrag einer fremden Regierung oder Vereinigung einen Brandanschlag auf ein noch nicht näher bestimmtes Gebäude oder eine Einrichtung kritischer Infrastruktur vorbereitet zu haben. Die beiden Beschuldigten befinden sich seit dem 7. Oktober in Untersuchungshaft. Ein durchgeführter Anschlag in Nürnberg ist nicht berichtet. Eine konkrete Auftraggebernation ist behördlich nicht festgestellt; die in Medien genannte Russland-Verbindung ist als Verdacht zu kennzeichnen. Für beide gilt die Unschuldsvermutung.</w:t>
+      </w:r>
+    </w:p>
+    <w:p>
+      <w:r>
+        <w:t>Faktenstatus: Ermittlungen und Untersuchungshaft BEHÖRDLICH BESTÄTIGT; Tatplan ist ein ERMITTLUNGSVORWURF, kein rechtskräftiger Nachweis; ausländischer Auftraggeber NICHT BESTÄTIGT.</w:t>
+      </w:r>
+    </w:p>
+    <w:p>
+      <w:r>
+        <w:t>Relevanz: HOCH für physische KRITIS- und Industriesicherheit in Deutschland; kein belegter Bezug zu AXA/YNCORIS/DLR.</w:t>
+      </w:r>
+    </w:p>
+    <w:p>
+      <w:r>
+        <w:t>Risikoeinschätzung: MITTEL als allgemeines deutsches Sabotageszenario; kein konkreter Standortalarm.</w:t>
+      </w:r>
+    </w:p>
+    <w:p>
+      <w:r>
+        <w:t>Empfehlung: Perimeterschutz, Auffälligkeiten im Umfeld, Brandschutz und Meldeketten in standortbezogenen Assessments prüfen; keine personenbezogenen Schuldzuweisungen.</w:t>
+      </w:r>
+    </w:p>
+    <w:p>
+      <w:r>
+        <w:t>Quellen: https://www.tagesschau.de/inland/bayern-ermittlungen-gegen-belarusen-sabotage-100.html ; https://www.reuters.com/world/german-police-arrest-two-suspected-planning-sabotage-attacks-russia-spiegel-says-2026-10-28/</w:t>
+      </w:r>
+    </w:p>
+    <w:p>
+      <w:pPr>
         <w:pStyle w:val="Heading1"/>
       </w:pPr>
       <w:r>
@@ -270,6 +313,49 @@
       </w:r>
     </w:p>
     <w:p>
+      <w:pPr>
+        <w:pStyle w:val="Heading2"/>
+      </w:pPr>
+      <w:r>
+        <w:t>06 | EUROPA / OT – Neue Medienrecherche zu Manipulation industrieller Steuerungen</w:t>
+      </w:r>
+    </w:p>
+    <w:p>
+      <w:r>
+        <w:t>Ereignisdatum: beschriebene Einzelvorfälle überwiegend 2024–2026, KEIN neuer einheitlicher Angriff am 28.10.2026. Veröffentlichung: Bloomberg, 27.10.2026, 21:10 UTC (= 28.10.2026, 22:10 MEZ); Zusammenfassung Meduza 28.10.2026.</w:t>
+      </w:r>
+    </w:p>
+    <w:p>
+      <w:r>
+        <w:t>Bloomberg berichtet über mehrere mutmaßliche und untersuchte Angriffe auf unzureichend gesicherte industrielle Steuerungssysteme in westlichen Ländern. Beispiele betreffen Wasseranlagen, industrielle Produktions- und Kühlprozesse. Meduza fasst die Recherche am 28. Oktober zusammen. Bei einzelnen Gruppen beruhen behauptete Erfolge auf Selbstdarstellungen, die Behörden ausdrücklich als teils übertrieben einschätzen. Die Berichterstattung ist eine neue Lageanalyse historischer Vorfälle und kein Beleg für einen am 28. Oktober neu erfolgten Angriff auf eine bestimmte Anlage.</w:t>
+      </w:r>
+    </w:p>
+    <w:p>
+      <w:r>
+        <w:t>Faktenstatus: Veröffentlichung und dargestellte Recherchen BESTÄTIGT; Attribution und Schadensursache der Einzelfälle unterschiedlich gut belegt; Täterbehauptungen NICHT automatisch verifiziert.</w:t>
+      </w:r>
+    </w:p>
+    <w:p>
+      <w:r>
+        <w:t>Relevanz: HOCH für OT/ICS, Wasser, Energie, Chemie und Industrie; MITTEL für Versicherer (Betriebsunterbrechung, Kumule).</w:t>
+      </w:r>
+    </w:p>
+    <w:p>
+      <w:r>
+        <w:t>Risikoeinschätzung: MITTEL als übertragbares OT-Sicherheitsrisiko; keine konkrete neue Betroffenheit der beobachteten Unternehmen.</w:t>
+      </w:r>
+    </w:p>
+    <w:p>
+      <w:r>
+        <w:t>Empfehlung: Internet-Exposition von Steuerungen, Fernwartungszugänge, Passwörter/MFA, Segmentierung, physische Notbedienbarkeit und Wiederanlauf gemeinsam prüfen.</w:t>
+      </w:r>
+    </w:p>
+    <w:p>
+      <w:r>
+        <w:t>Quellen: https://news.bloomberglaw.com/artificial-intelligence/hackers-sympathetic-to-russia-are-hitting-utilities-factories ; https://meduza.io/en/feature/2026/10/28/russia-linked-hackers-are-exploiting-poorly-secured-industrial-systems-to-sabotage-factories-utilities-and-food-production-across-the-west-bloomberg-reports</w:t>
+      </w:r>
+    </w:p>
+    <w:p>
       <w:r>
         <w:t>Versicherungsbranche: Für den Berichtszeitraum wurde in der selektiven Recherche kein neuer, unabhängig bestätigter Cyberangriff auf einen Versicherer mit Veröffentlichungsdatum 28.10.2026 festgestellt. Die bereits am 27.10.2026 publizierte Untersuchung eines möglichen Vorfalls bei Rand Mutual Assurance wird nicht als neue bestätigte Meldung ausgegeben. RMA hat nach eigenen Angaben noch nicht bestätigt, dass Daten abgeflossen sind. Hintergrundquelle: https://www.itweb.co.za/article/rand-mutual-probes-alleged-breach-of-168m-claims/G98YdqLGAgXMX2PD</w:t>
       </w:r>
@@ -317,32 +403,111 @@
         <w:pStyle w:val="Heading1"/>
       </w:pPr>
       <w:r>
-        <w:t>D. Priorisierte Empfehlungen</w:t>
+        <w:t>D. Vorausschauende Sicherheitslage – 29.10. bis 05.11.2026 (7 Tage)</w:t>
       </w:r>
     </w:p>
     <w:p>
       <w:r>
-        <w:t>1. Kritische Abhängigkeiten zwischen Strom, Treibstoff, Wasser, Kommunikations- und Zutrittssystemen bei Standortassessments und BCM-Szenarien gemeinsam prüfen.</w:t>
+        <w:t>Prüfstand: 29.10.2026, ca. 01:02 Uhr MEZ. Die nachfolgenden Ankündigungen sind ausdrücklich keine bereits eingetretenen Vorfälle. Ein möglicher Sicherheitsbezug wird als analytische Einschätzung gekennzeichnet.</w:t>
+      </w:r>
+    </w:p>
+    <w:p>
+      <w:pPr>
+        <w:pStyle w:val="Heading2"/>
+      </w:pPr>
+      <w:r>
+        <w:t>V01 | 31.10.2026 – Bundesweiter Aktionstag „Gen Z regelt“ / Demonstrationen in NRW</w:t>
       </w:r>
     </w:p>
     <w:p>
       <w:r>
-        <w:t>2. Für internationale Energie- und Transportexponierungen nachweisbare Sachschäden und bestätigte Betriebsunterbrechungen von Kriegsparteibehauptungen strikt trennen.</w:t>
+        <w:t>Geplantes Datum: Samstag, 31.10.2026. Orte: mehr als 30 Städte deutschlandweit; in NRW unter anderem Köln, Bonn, Düsseldorf, Dortmund und Münster. Köln: angemeldeter Aufzug ab 14:00 Uhr am Heumarkt, laut WDR 14:00–19:00 Uhr; der Anmelder nennt rund 15.000 Teilnehmende. Die tatsächliche Teilnehmerzahl ist offen; unverbindliche Online-Zusagen sind keine belastbare Besucherprognose. Veröffentlichungen: WDR 27.10.2026 und 28.10.2026, Tagesschau 28.10.2026, 20:02 Uhr.</w:t>
       </w:r>
     </w:p>
     <w:p>
       <w:r>
-        <w:t>3. Bei Drohnenvorfällen die operative Meldelage, Behördenkommunikation und die Folgen für angrenzende Versorgungsnetze in einer einheitlichen Lagebewertung zusammenführen.</w:t>
+        <w:t>Bestätigungsstatus: Kölner Versammlungsanmeldung und bundesweite Mobilisierung durch Medien/Polizeiauskünfte belegt; einzelne Orte, Teilnehmerzahlen und Routen können sich ändern. Der NRW-Verfassungsschutz weist auf Mobilisierungsversuche extremistischer Akteure hin. Nach Polizeiangaben lagen am 28. Oktober jedoch in keiner der genannten Städte konkrete Hinweise auf geplante Gewalttaten vor. Die Organisatoren werben für friedliche Proteste. Gewalt ist nicht vorhergesagt oder unterstellt.</w:t>
       </w:r>
     </w:p>
     <w:p>
       <w:r>
-        <w:t>4. Ransomware-Leaksite-Meldungen ausschließlich als unbestätigte Frühindikatoren führen, bis unabhängige Bestätigung vorliegt.</w:t>
+        <w:t>Mögliche Betroffenheit: Innenstadtnah gelegene Versicherungs-/Verwaltungsstandorte, Besucher, Empfangsbereiche, Zufahrten und Lieferwege; nur bei tatsächlicher Nähe zu Veranstaltungsflächen/Routen. Für AXA, YNCORIS, DLR, Infraserv Hürth oder Chemiepark Knapsack wurde keine gezielte Bedrohung belegt.</w:t>
       </w:r>
     </w:p>
     <w:p>
       <w:r>
-        <w:t>5. Bei allen Zielorganisationen nur öffentlich belegte Ereignisse berichten; fehlende Treffer transparent als Recherchegrenze benennen.</w:t>
+        <w:t>Eintrittsunsicherheit: Veranstaltung HOCH wahrscheinlich / konkret angemeldet (Köln); Gewalt NICHT BELEGT, Eintrittsunsicherheit HOCH.</w:t>
+      </w:r>
+    </w:p>
+    <w:p>
+      <w:r>
+        <w:t>Risikoeinschätzung: MITTEL für Erreichbarkeit und situative Sachschäden exponierter Innenstadtstandorte; ohne räumlichen Bezug NIEDRIG. Keine pauschale Gefahrenstufe für alle AXA-Standorte.</w:t>
+      </w:r>
+    </w:p>
+    <w:p>
+      <w:r>
+        <w:t>Empfehlungen: Am 30.10. behördliche Lage und Routen aktualisieren; freitags besonders Türen zu Sicherheitsbereichen, temporäre Bau-/Umbauöffnungen und Verschlusskontrollen prüfen; hochwertige mobile Gegenstände aus exponierten Eingangsbereichen entfernen; bei tatsächlich exponierten Standorten ohne EMA eine zusätzliche Revierfahrt risikobasiert prüfen; Sicherheitsdienst/Empfang und Meldewege sensibilisieren. Versammlungsfreiheit respektieren und keine unberechtigte Behinderung friedlicher Versammlungen.</w:t>
+      </w:r>
+    </w:p>
+    <w:p>
+      <w:r>
+        <w:t>Quellen: https://www.tagesschau.de/inland/regional/nordrheinwestfalen/wdr-proteste-am-samstag-droht-bei-den-gen-z-demos-gewalt-wie-in-frankreich-100.html ; https://www1.wdr.de/nrw/koeln/proteste-gen-z-polizei-samstag-koeln-aachen-100.html ; https://koeln.t-online.de/region/koeln/id_101501560/-gen-z-regelt-demo-in-koeln-15000-menschen-wollen-samstag-auf-die-strasse.html</w:t>
+      </w:r>
+    </w:p>
+    <w:p>
+      <w:pPr>
+        <w:pStyle w:val="Heading2"/>
+      </w:pPr>
+      <w:r>
+        <w:t>V02 | 31.10.2026 – Halloween: zusätzliche Sicherheitslage im Ruhrgebiet</w:t>
+      </w:r>
+    </w:p>
+    <w:p>
+      <w:r>
+        <w:t>Geplantes Datum: 31.10.2026, vor allem Abend/Nacht. Orte: verschiedene Städte im Ruhrgebiet, insbesondere Duisburg, Essen, Marl und Bottrop im Rückblick; nicht automatisch jede Stadt betroffen. Veröffentlichung: WDR 28.10.2026, 05:03 Uhr.</w:t>
+      </w:r>
+    </w:p>
+    <w:p>
+      <w:r>
+        <w:t>Bestätigungsstatus: Vorbereitungen und erhöhte Polizeipräsenz in mehreren Städten berichtet; vergangene Sachbeschädigungen und Pyrotechnikvorfälle belegt. Für den kommenden 31. Oktober ist daraus kein konkreter Angriff auf Unternehmen ableitbar. In Bottrop gilt laut WDR vom 24.10. bis 07.11. ein verschärftes lokales Böllerverbot.</w:t>
+      </w:r>
+    </w:p>
+    <w:p>
+      <w:r>
+        <w:t>Mögliche Betroffenheit: unbesetzte bzw. publikumsnahe Gebäude, Eingangsbereiche, Schaufenster und Fahrzeugflächen in örtlichen Hotspots; keine nachgewiesene direkte Betroffenheit der Zielunternehmen.</w:t>
+      </w:r>
+    </w:p>
+    <w:p>
+      <w:r>
+        <w:t>Eintrittsunsicherheit: Halloween als Veranstaltung BESTÄTIGT; erneute konkrete Ausschreitungen OFFEN.</w:t>
+      </w:r>
+    </w:p>
+    <w:p>
+      <w:r>
+        <w:t>Risikoeinschätzung: LOKAL MITTEL für exponierte Gebäude in bekannten Brennpunkten; sonst NIEDRIG.</w:t>
+      </w:r>
+    </w:p>
+    <w:p>
+      <w:r>
+        <w:t>Empfehlungen: Objektschutz und Verschlussroutine, sichere Abstellung von Wertgegenständen, ggf. abgestimmte Kontrollfahrten und Lagekontakt mit lokaler Polizei; keine generelle Alarmierung aller Standorte.</w:t>
+      </w:r>
+    </w:p>
+    <w:p>
+      <w:r>
+        <w:t>Quelle: https://www1.wdr.de/nrw/ruhrgebiet/halloween-krawalle-sicherheit-polizei-100.html</w:t>
+      </w:r>
+    </w:p>
+    <w:p>
+      <w:pPr>
+        <w:pStyle w:val="Heading2"/>
+      </w:pPr>
+      <w:r>
+        <w:t>V03 | 29.10.–05.11.2026 – Weiterbeobachtung ohne bestätigten zusätzlichen Einzeltermin</w:t>
+      </w:r>
+    </w:p>
+    <w:p>
+      <w:r>
+        <w:t>Für AXA/AXA-Vorstände, YNCORIS, DLR, Infraserv Hürth, Chemiepark Knapsack sowie die Versicherungsbranche wurden im geprüften öffentlichen Material über V01/V02 hinaus keine weiteren konkret datierten, verifizierten Ereignisse im 7-Tage-Fenster gefunden, die eine eigene Warnmeldung rechtfertigen. Das ist ein begrenzter negativer Recherchebefund und keine Zusicherung von Vorfallsfreiheit. Die Entwicklung zu OT-Cyberbedrohungen und mutmaßlichen Sabotageplänen wird fortlaufend beobachtet; konkrete Angriffszeitpunkte sind NICHT bekannt.</w:t>
       </w:r>
     </w:p>
     <w:p>
@@ -350,12 +515,55 @@
         <w:pStyle w:val="Heading1"/>
       </w:pPr>
       <w:r>
-        <w:t>E. Methodik und Grenzen</w:t>
+        <w:t>E. Priorisierte Empfehlungen</w:t>
+      </w:r>
+    </w:p>
+    <w:p>
+      <w:r>
+        <w:t>1. Vor dem 31.10. für innenstadtnahe Standorte Veranstaltungsrouten, Verschlusskontrollen, temporäre bauliche Öffnungen, Schutz mobiler Werte und ggf. zusätzliche Revierfahrten risikobasiert prüfen; keine unbelegten Gewaltannahmen.</w:t>
+      </w:r>
+    </w:p>
+    <w:p>
+      <w:r>
+        <w:t>2. Kritische Abhängigkeiten zwischen Strom, Treibstoff, Wasser, Kommunikations- und Zutrittssystemen bei Standortassessments und BCM-Szenarien gemeinsam prüfen.</w:t>
+      </w:r>
+    </w:p>
+    <w:p>
+      <w:r>
+        <w:t>3. Für internationale Energie- und Transportexponierungen nachweisbare Sachschäden und bestätigte Betriebsunterbrechungen von Kriegsparteibehauptungen strikt trennen.</w:t>
+      </w:r>
+    </w:p>
+    <w:p>
+      <w:r>
+        <w:t>4. Bei Drohnenvorfällen die operative Meldelage, Behördenkommunikation und die Folgen für angrenzende Versorgungsnetze in einer einheitlichen Lagebewertung zusammenführen.</w:t>
+      </w:r>
+    </w:p>
+    <w:p>
+      <w:r>
+        <w:t>5. Ransomware-Leaksite-Meldungen ausschließlich als unbestätigte Frühindikatoren führen, bis unabhängige Bestätigung vorliegt.</w:t>
+      </w:r>
+    </w:p>
+    <w:p>
+      <w:r>
+        <w:t>6. Bei allen Zielorganisationen nur öffentlich belegte Ereignisse berichten; fehlende Treffer transparent als Recherchegrenze benennen.</w:t>
+      </w:r>
+    </w:p>
+    <w:p>
+      <w:pPr>
+        <w:pStyle w:val="Heading1"/>
+      </w:pPr>
+      <w:r>
+        <w:t>F. Methodik und Grenzen</w:t>
       </w:r>
     </w:p>
     <w:p>
       <w:r>
         <w:t>Zeitfenster 28.10.2026, 00:10 bis 29.10.2026, 00:10 MEZ. Auswahl aus öffentlichen Meldungen, ohne eigene forensische oder Vor-Ort-Verifikation. Ein älteres Ereignis wird nur dann aufgenommen, wenn im Fenster eine neue belegte Entwicklung veröffentlicht wurde; dies wird ausdrücklich markiert. Für Quellen ohne belastbare Veröffentlichungsuhrzeit wird nur das Datum genannt. Täterangaben, politische Anschuldigungen und Leaksite-Einträge sind nicht automatisch Tatsachen. Bewertungen sind qualitative Analysen, keine amtlichen Warnstufen.</w:t>
+      </w:r>
+    </w:p>
+    <w:p>
+      <w:r>
+        <w:t>7-Tage-Ausblick: 29.10.–05.11.2026, separat vom 24-Stunden-Rückblick; Termin- und Gewaltprognosen strikt getrennt.</w:t>
       </w:r>
     </w:p>
     <w:p>

</xml_diff>